<commit_message>
Correct roster: Suranjit Paul is an instructor, not a group member
Group 1 is Abdul-Ramon Adeyemi Folarin, Immanuel Guarin and Sherman Law;
instructors are Suranjit Paul and Mark Shtern - fixed on the report
title page and the deck title slide.

Co-authored-by: Adeyemi Folarin <devzephyr@users.noreply.github.com>
</commit_message>
<xml_diff>
--- a/devsecops/deliverables/DevSecOps_Final_Report.docx
+++ b/devsecops/deliverables/DevSecOps_Final_Report.docx
@@ -23,7 +23,7 @@
           <w:b w:val="0"/>
           <w:i w:val="0"/>
         </w:rPr>
-        <w:t>Abdul-Ramon Adeyemi Folarin, Immanuel Guarin, Sherman Law, and Suranjit Paul</w:t>
+        <w:t>Abdul-Ramon Adeyemi Folarin, Immanuel Guarin, and Sherman Law</w:t>
       </w:r>
     </w:p>
     <w:p>
@@ -47,7 +47,7 @@
           <w:b w:val="0"/>
           <w:i w:val="0"/>
         </w:rPr>
-        <w:t>Instructor: Mark Shtern</w:t>
+        <w:t>Instructors: Suranjit Paul and Mark Shtern</w:t>
       </w:r>
     </w:p>
     <w:p>

</xml_diff>

<commit_message>
Record the upstream patch of GHSA-pjrx (kimai/kimai#6089)
The advisory initially declined as documented behavior was patched
upstream exactly as proposed: role management now respects the role
hierarchy (merged 2026-08-02). Updated the bug report doc, the LNCS
report, the deck and the checklist - maintainer approval is now met
through the merged upstream fix.

Co-authored-by: Adeyemi Folarin <devzephyr@users.noreply.github.com>
</commit_message>
<xml_diff>
--- a/devsecops/deliverables/DevSecOps_Final_Report.docx
+++ b/devsecops/deliverables/DevSecOps_Final_Report.docx
@@ -1832,7 +1832,7 @@
           <w:b w:val="0"/>
           <w:i w:val="0"/>
         </w:rPr>
-        <w:t>6.2 GHSA-pjrx-mwv9-j9vf - Rejected as Documented Behavior (Lesson Learned)</w:t>
+        <w:t>6.2 GHSA-pjrx-mwv9-j9vf - Patched Upstream Following the Report</w:t>
       </w:r>
     </w:p>
     <w:p>
@@ -1844,7 +1844,7 @@
           <w:b w:val="0"/>
           <w:i w:val="0"/>
         </w:rPr>
-        <w:t>A second report about ROLE_SUPER_ADMIN delegation via roles_other_profile was closed by the maintainer as documented, intended behavior: the permissions are labeled SECURITY ALERT and are super-admin-only by default. The claimed HTTP 500 side effect could not be reproduced on the current codebase (clean HTTP 200 with correct serialization). Lesson: verify the documented threat model of the project before filing.</w:t>
+        <w:t>A second report covered ROLE_SUPER_ADMIN delegation via roles_other_profile with a full proof of concept and a concrete solution (restrict role assignment to the acting user's own privilege level). The maintainer first closed it as documented behavior, noting the permissions are labeled SECURITY ALERT and super-admin-only by default - while agreeing the design 'probably doesn't make a lot of sense'. The report was then patched upstream: kimai/kimai PR #6089 (merged 2026-08-02) implements exactly the proposed hierarchy restriction, preventing lower-privileged users from granting or revoking roles above their own level. The reporter is credited on the advisory. Lesson in both directions: verify the documented threat model before filing - and a well-argued report can drive a hardening change even when the first answer is 'by design'.</w:t>
       </w:r>
     </w:p>
     <w:p>

</xml_diff>